<commit_message>
Table 6.4: in-document per-pair XSTest judge ΔOR table + claim-lock check
Adds the full five-pair judge ΔOR table (both mappings, CIs, McNemar p, primary
regex column) to §6.12 Result 6, per pre-reg §5.1 amendment 2 (report the table
regardless of direction). Names the exploratory Qwen3-1.7B +0.040 strict move.
verify_report_claims.py gains a check pinning every Table 6.4 cell to the
committed artifacts (perturb self-tested). verify-claims 67/67.

Co-Authored-By: Claude Fable 5 <noreply@anthropic.com>
</commit_message>
<xml_diff>
--- a/docs/FYP_Report_2026-07-01_humanized.docx
+++ b/docs/FYP_Report_2026-07-01_humanized.docx
@@ -18578,7 +18578,786 @@
           <w:sz w:val="22"/>
           <w:szCs w:val="22"/>
         </w:rPr>
-        <w:t xml:space="preserve">Result 6: the over-refusal axis is scorer-sensitive too, and the one over-refusal survivor does not replicate under an independent judge. The validation above concerns HarmBench ASR; the study's third multiplicity-robust finding, by contrast, is an XSTest over-refusal decrease scored by the demoted v2 refusal regex (Phi-4-mini, ΔOR = −0.048, §6.5.1). To test whether that regex-scored finding is scorer-robust, the same question the classifier answered for HarmBench, the 3,750 saved benign XSTest responses (fifteen aliases × 250 prompts) were re-scored by an independent API judge (gpt-4o, pinned dated snapshot gpt-4o-2024-08-06, temperature 0, zero parse failures) that labels each response by the XSTest paper's own three-class taxonomy: full compliance, partial refusal, full refusal (Röttger et al. [5], who themselves use a GPT-4 judge with this taxonomy). Strict over-refusal counts full refusals only (the conservative reading); broad counts partial or full. This is a sensitivity check, not a change of scorer: the deterministic regex remains the primary over-refusal scorer of record and the multiple-comparison family of §6.5.1 is unchanged. The finding parallels the HarmBench one. First, the two scorers disagree substantially on benign over-refusal: the judge counts roughly four times as many refusals as the regex (mean over-refusal 0.171 strict versus 0.044), because it treats moral lectures, redirections, and answer-free 'I can't do X but I can do Y' alternatives as refusals whereas the keyword regex does not, and per-alias agreement is only poor-to-moderate (Cohen κ from −0.01 to 0.50 across the ten NF4 aliases). Second, and decisively, the Phi-4-mini over-refusal decrease does not replicate: under the judge the Phi ΔOR is +0.016 (strict; direction reversed, CI [−0.028, +0.060], McNemar p = 0.597) or −0.004 (broad; CI [−0.048, +0.036], McNemar p = 1.000), not significant under either mapping, and neither reproduces the regex's −0.048 decrease. No pair shows a significant judge ΔOR under either mapping (every CI includes zero), which is consistent with the study's RQ2 over-refusal null, but the direction and magnitude diverge from the regex most sharply for the one contrast that had survived multiplicity correction. The honest reading, carried into §6.5 and the Abstract, is that the single FDR-surviving over-refusal contrast is scorer-dependent: it is a reproducible property of the refusal regex, not a classifier- or human-validated over-refusal shift. This extends the chapter's central message, the scorer determines the conclusion, from the harmful-compliance axis to the over-refusal axis. As with the second HarmBench judge, the benign prompt and saved response were transmitted to an external API for this check (public benchmark text; only redacted identifier-and-label sidecars are stored, enforced by the same redaction contract), and a human-labelled refusal gold set remains the natural next strengthening (Chapter 9). Full per-alias agreement and all five per-pair judge ΔORs, reported regardless of direction as exploratory sensitivity results, are in results_512/analysis/xstest_judge_agreement.{json,csv} (redacted); no new significance claim enters the pre-registered multiplicity family.</w:t>
+        <w:t xml:space="preserve">Result 6: the over-refusal axis is scorer-sensitive too, and the one over-refusal survivor does not replicate under an independent judge. The validation above concerns HarmBench ASR; the study's third multiplicity-robust finding, by contrast, is an XSTest over-refusal decrease scored by the demoted v2 refusal regex (Phi-4-mini, ΔOR = −0.048, §6.5.1). To test whether that regex-scored finding is scorer-robust, the same question the classifier answered for HarmBench, the 3,750 saved benign XSTest responses (fifteen aliases × 250 prompts) were re-scored by an independent API judge (gpt-4o, pinned dated snapshot gpt-4o-2024-08-06, temperature 0, zero parse failures) that labels each response by the XSTest paper's own three-class taxonomy: full compliance, partial refusal, full refusal (Röttger et al. [5], who themselves use a GPT-4 judge with this taxonomy). Strict over-refusal counts full refusals only (the conservative reading); broad counts partial or full. This is a sensitivity check, not a change of scorer: the deterministic regex remains the primary over-refusal scorer of record and the multiple-comparison family of §6.5.1 is unchanged. The finding parallels the HarmBench one. First, the two scorers disagree substantially on benign over-refusal: the judge counts roughly four times as many refusals as the regex (mean over-refusal 0.171 strict versus 0.044), because it treats moral lectures, redirections, and answer-free 'I can't do X but I can do Y' alternatives as refusals whereas the keyword regex does not, and per-alias agreement is only poor-to-moderate (Cohen κ from −0.01 to 0.50 across the ten NF4 aliases). Second, and decisively, the Phi-4-mini over-refusal decrease does not replicate: under the judge the Phi ΔOR is +0.016 (strict; direction reversed, CI [−0.028, +0.060], McNemar p = 0.597) or −0.004 (broad; CI [−0.048, +0.036], McNemar p = 1.000), not significant under either mapping, and neither reproduces the regex's −0.048 decrease. No pair shows a significant judge ΔOR under either mapping (every CI includes zero), which is consistent with the study's RQ2 over-refusal null, but the direction and magnitude diverge from the regex most sharply for the one contrast that had survived multiplicity correction. The honest reading, carried into §6.5 and the Abstract, is that the single FDR-surviving over-refusal contrast is scorer-dependent: it is a reproducible property of the refusal regex, not a classifier- or human-validated over-refusal shift. This extends the chapter's central message, the scorer determines the conclusion, from the harmful-compliance axis to the over-refusal axis. As with the second HarmBench judge, the benign prompt and saved response were transmitted to an external API for this check (public benchmark text; only redacted identifier-and-label sidecars are stored, enforced by the same redaction contract), and a human-labelled refusal gold set remains the natural next strengthening (Chapter 9). All five per-pair judge ΔORs are reported in Table 6.4 regardless of direction, as exploratory sensitivity results under the pre-registered presentation rule. The largest, Qwen3-1.7B's +0.040 (strict; McNemar p = 0.087), is an apparent increase that does not reach significance. Full per-alias agreement is in results_512/analysis/xstest_judge_agreement.{json,csv} (redacted); no new significance claim enters the pre-registered multiplicity family.</w:t>
+      </w:r>
+    </w:p>
+    <w:tbl>
+      <w:tblPr>
+        <w:tblW w:type="dxa" w:w="9360"/>
+        <w:tblBorders>
+          <w:top w:val="single" w:color="999999" w:sz="4"/>
+          <w:left w:val="single" w:color="999999" w:sz="4"/>
+          <w:bottom w:val="single" w:color="999999" w:sz="4"/>
+          <w:right w:val="single" w:color="999999" w:sz="4"/>
+          <w:insideH w:val="single" w:color="999999" w:sz="4"/>
+          <w:insideV w:val="single" w:color="999999" w:sz="4"/>
+        </w:tblBorders>
+      </w:tblPr>
+      <w:tblGrid>
+        <w:gridCol w:w="1500"/>
+        <w:gridCol w:w="1700"/>
+        <w:gridCol w:w="2800"/>
+        <w:gridCol w:w="2800"/>
+      </w:tblGrid>
+      <w:tr>
+        <w:trPr>
+          <w:tblHeader/>
+        </w:trPr>
+        <w:tc>
+          <w:tcPr>
+            <w:tcW w:type="dxa" w:w="1500"/>
+            <w:tcBorders>
+              <w:top w:val="single" w:color="999999" w:sz="4"/>
+              <w:left w:val="single" w:color="999999" w:sz="4"/>
+              <w:bottom w:val="single" w:color="999999" w:sz="4"/>
+              <w:right w:val="single" w:color="999999" w:sz="4"/>
+            </w:tcBorders>
+            <w:shd w:fill="D9E2F3" w:color="auto" w:val="clear"/>
+            <w:tcMar>
+              <w:top w:type="dxa" w:w="80"/>
+              <w:left w:type="dxa" w:w="120"/>
+              <w:bottom w:type="dxa" w:w="80"/>
+              <w:right w:type="dxa" w:w="120"/>
+            </w:tcMar>
+          </w:tcPr>
+          <w:p>
+            <w:pPr>
+              <w:spacing w:after="0"/>
+            </w:pPr>
+            <w:r>
+              <w:rPr>
+                <w:rFonts w:ascii="Calibri" w:cs="Calibri" w:eastAsia="Calibri" w:hAnsi="Calibri"/>
+                <w:b/>
+                <w:bCs/>
+                <w:sz w:val="20"/>
+                <w:szCs w:val="20"/>
+              </w:rPr>
+              <w:t xml:space="preserve">Pair</w:t>
+            </w:r>
+          </w:p>
+        </w:tc>
+        <w:tc>
+          <w:tcPr>
+            <w:tcW w:type="dxa" w:w="1700"/>
+            <w:tcBorders>
+              <w:top w:val="single" w:color="999999" w:sz="4"/>
+              <w:left w:val="single" w:color="999999" w:sz="4"/>
+              <w:bottom w:val="single" w:color="999999" w:sz="4"/>
+              <w:right w:val="single" w:color="999999" w:sz="4"/>
+            </w:tcBorders>
+            <w:shd w:fill="D9E2F3" w:color="auto" w:val="clear"/>
+            <w:tcMar>
+              <w:top w:type="dxa" w:w="80"/>
+              <w:left w:type="dxa" w:w="120"/>
+              <w:bottom w:type="dxa" w:w="80"/>
+              <w:right w:type="dxa" w:w="120"/>
+            </w:tcMar>
+          </w:tcPr>
+          <w:p>
+            <w:pPr>
+              <w:spacing w:after="0"/>
+            </w:pPr>
+            <w:r>
+              <w:rPr>
+                <w:rFonts w:ascii="Calibri" w:cs="Calibri" w:eastAsia="Calibri" w:hAnsi="Calibri"/>
+                <w:b/>
+                <w:bCs/>
+                <w:sz w:val="20"/>
+                <w:szCs w:val="20"/>
+              </w:rPr>
+              <w:t xml:space="preserve">Regex ΔOR (primary)</w:t>
+            </w:r>
+          </w:p>
+        </w:tc>
+        <w:tc>
+          <w:tcPr>
+            <w:tcW w:type="dxa" w:w="2800"/>
+            <w:tcBorders>
+              <w:top w:val="single" w:color="999999" w:sz="4"/>
+              <w:left w:val="single" w:color="999999" w:sz="4"/>
+              <w:bottom w:val="single" w:color="999999" w:sz="4"/>
+              <w:right w:val="single" w:color="999999" w:sz="4"/>
+            </w:tcBorders>
+            <w:shd w:fill="D9E2F3" w:color="auto" w:val="clear"/>
+            <w:tcMar>
+              <w:top w:type="dxa" w:w="80"/>
+              <w:left w:type="dxa" w:w="120"/>
+              <w:bottom w:type="dxa" w:w="80"/>
+              <w:right w:type="dxa" w:w="120"/>
+            </w:tcMar>
+          </w:tcPr>
+          <w:p>
+            <w:pPr>
+              <w:spacing w:after="0"/>
+            </w:pPr>
+            <w:r>
+              <w:rPr>
+                <w:rFonts w:ascii="Calibri" w:cs="Calibri" w:eastAsia="Calibri" w:hAnsi="Calibri"/>
+                <w:b/>
+                <w:bCs/>
+                <w:sz w:val="20"/>
+                <w:szCs w:val="20"/>
+              </w:rPr>
+              <w:t xml:space="preserve">Judge ΔOR strict (95% CI; p)</w:t>
+            </w:r>
+          </w:p>
+        </w:tc>
+        <w:tc>
+          <w:tcPr>
+            <w:tcW w:type="dxa" w:w="2800"/>
+            <w:tcBorders>
+              <w:top w:val="single" w:color="999999" w:sz="4"/>
+              <w:left w:val="single" w:color="999999" w:sz="4"/>
+              <w:bottom w:val="single" w:color="999999" w:sz="4"/>
+              <w:right w:val="single" w:color="999999" w:sz="4"/>
+            </w:tcBorders>
+            <w:shd w:fill="D9E2F3" w:color="auto" w:val="clear"/>
+            <w:tcMar>
+              <w:top w:type="dxa" w:w="80"/>
+              <w:left w:type="dxa" w:w="120"/>
+              <w:bottom w:type="dxa" w:w="80"/>
+              <w:right w:type="dxa" w:w="120"/>
+            </w:tcMar>
+          </w:tcPr>
+          <w:p>
+            <w:pPr>
+              <w:spacing w:after="0"/>
+            </w:pPr>
+            <w:r>
+              <w:rPr>
+                <w:rFonts w:ascii="Calibri" w:cs="Calibri" w:eastAsia="Calibri" w:hAnsi="Calibri"/>
+                <w:b/>
+                <w:bCs/>
+                <w:sz w:val="20"/>
+                <w:szCs w:val="20"/>
+              </w:rPr>
+              <w:t xml:space="preserve">Judge ΔOR broad (95% CI; p)</w:t>
+            </w:r>
+          </w:p>
+        </w:tc>
+      </w:tr>
+      <w:tr>
+        <w:tc>
+          <w:tcPr>
+            <w:tcW w:type="dxa" w:w="1500"/>
+            <w:tcBorders>
+              <w:top w:val="single" w:color="999999" w:sz="4"/>
+              <w:left w:val="single" w:color="999999" w:sz="4"/>
+              <w:bottom w:val="single" w:color="999999" w:sz="4"/>
+              <w:right w:val="single" w:color="999999" w:sz="4"/>
+            </w:tcBorders>
+            <w:tcMar>
+              <w:top w:type="dxa" w:w="80"/>
+              <w:left w:type="dxa" w:w="120"/>
+              <w:bottom w:type="dxa" w:w="80"/>
+              <w:right w:type="dxa" w:w="120"/>
+            </w:tcMar>
+          </w:tcPr>
+          <w:p>
+            <w:pPr>
+              <w:spacing w:after="0"/>
+            </w:pPr>
+            <w:r>
+              <w:rPr>
+                <w:rFonts w:ascii="Calibri" w:cs="Calibri" w:eastAsia="Calibri" w:hAnsi="Calibri"/>
+                <w:sz w:val="20"/>
+                <w:szCs w:val="20"/>
+              </w:rPr>
+              <w:t xml:space="preserve">qwen_2b</w:t>
+            </w:r>
+          </w:p>
+        </w:tc>
+        <w:tc>
+          <w:tcPr>
+            <w:tcW w:type="dxa" w:w="1700"/>
+            <w:tcBorders>
+              <w:top w:val="single" w:color="999999" w:sz="4"/>
+              <w:left w:val="single" w:color="999999" w:sz="4"/>
+              <w:bottom w:val="single" w:color="999999" w:sz="4"/>
+              <w:right w:val="single" w:color="999999" w:sz="4"/>
+            </w:tcBorders>
+            <w:tcMar>
+              <w:top w:type="dxa" w:w="80"/>
+              <w:left w:type="dxa" w:w="120"/>
+              <w:bottom w:type="dxa" w:w="80"/>
+              <w:right w:type="dxa" w:w="120"/>
+            </w:tcMar>
+          </w:tcPr>
+          <w:p>
+            <w:pPr>
+              <w:spacing w:after="0"/>
+            </w:pPr>
+            <w:r>
+              <w:rPr>
+                <w:rFonts w:ascii="Calibri" w:cs="Calibri" w:eastAsia="Calibri" w:hAnsi="Calibri"/>
+                <w:sz w:val="20"/>
+                <w:szCs w:val="20"/>
+              </w:rPr>
+              <w:t xml:space="preserve">−0.024</w:t>
+            </w:r>
+          </w:p>
+        </w:tc>
+        <w:tc>
+          <w:tcPr>
+            <w:tcW w:type="dxa" w:w="2800"/>
+            <w:tcBorders>
+              <w:top w:val="single" w:color="999999" w:sz="4"/>
+              <w:left w:val="single" w:color="999999" w:sz="4"/>
+              <w:bottom w:val="single" w:color="999999" w:sz="4"/>
+              <w:right w:val="single" w:color="999999" w:sz="4"/>
+            </w:tcBorders>
+            <w:tcMar>
+              <w:top w:type="dxa" w:w="80"/>
+              <w:left w:type="dxa" w:w="120"/>
+              <w:bottom w:type="dxa" w:w="80"/>
+              <w:right w:type="dxa" w:w="120"/>
+            </w:tcMar>
+          </w:tcPr>
+          <w:p>
+            <w:pPr>
+              <w:spacing w:after="0"/>
+            </w:pPr>
+            <w:r>
+              <w:rPr>
+                <w:rFonts w:ascii="Calibri" w:cs="Calibri" w:eastAsia="Calibri" w:hAnsi="Calibri"/>
+                <w:sz w:val="20"/>
+                <w:szCs w:val="20"/>
+              </w:rPr>
+              <w:t xml:space="preserve">+0.040 [0.000, +0.080]; 0.087</w:t>
+            </w:r>
+          </w:p>
+        </w:tc>
+        <w:tc>
+          <w:tcPr>
+            <w:tcW w:type="dxa" w:w="2800"/>
+            <w:tcBorders>
+              <w:top w:val="single" w:color="999999" w:sz="4"/>
+              <w:left w:val="single" w:color="999999" w:sz="4"/>
+              <w:bottom w:val="single" w:color="999999" w:sz="4"/>
+              <w:right w:val="single" w:color="999999" w:sz="4"/>
+            </w:tcBorders>
+            <w:tcMar>
+              <w:top w:type="dxa" w:w="80"/>
+              <w:left w:type="dxa" w:w="120"/>
+              <w:bottom w:type="dxa" w:w="80"/>
+              <w:right w:type="dxa" w:w="120"/>
+            </w:tcMar>
+          </w:tcPr>
+          <w:p>
+            <w:pPr>
+              <w:spacing w:after="0"/>
+            </w:pPr>
+            <w:r>
+              <w:rPr>
+                <w:rFonts w:ascii="Calibri" w:cs="Calibri" w:eastAsia="Calibri" w:hAnsi="Calibri"/>
+                <w:sz w:val="20"/>
+                <w:szCs w:val="20"/>
+              </w:rPr>
+              <w:t xml:space="preserve">+0.040 [−0.004, +0.084]; 0.110</w:t>
+            </w:r>
+          </w:p>
+        </w:tc>
+      </w:tr>
+      <w:tr>
+        <w:tc>
+          <w:tcPr>
+            <w:tcW w:type="dxa" w:w="1500"/>
+            <w:tcBorders>
+              <w:top w:val="single" w:color="999999" w:sz="4"/>
+              <w:left w:val="single" w:color="999999" w:sz="4"/>
+              <w:bottom w:val="single" w:color="999999" w:sz="4"/>
+              <w:right w:val="single" w:color="999999" w:sz="4"/>
+            </w:tcBorders>
+            <w:tcMar>
+              <w:top w:type="dxa" w:w="80"/>
+              <w:left w:type="dxa" w:w="120"/>
+              <w:bottom w:type="dxa" w:w="80"/>
+              <w:right w:type="dxa" w:w="120"/>
+            </w:tcMar>
+          </w:tcPr>
+          <w:p>
+            <w:pPr>
+              <w:spacing w:after="0"/>
+            </w:pPr>
+            <w:r>
+              <w:rPr>
+                <w:rFonts w:ascii="Calibri" w:cs="Calibri" w:eastAsia="Calibri" w:hAnsi="Calibri"/>
+                <w:sz w:val="20"/>
+                <w:szCs w:val="20"/>
+              </w:rPr>
+              <w:t xml:space="preserve">qwen_4b</w:t>
+            </w:r>
+          </w:p>
+        </w:tc>
+        <w:tc>
+          <w:tcPr>
+            <w:tcW w:type="dxa" w:w="1700"/>
+            <w:tcBorders>
+              <w:top w:val="single" w:color="999999" w:sz="4"/>
+              <w:left w:val="single" w:color="999999" w:sz="4"/>
+              <w:bottom w:val="single" w:color="999999" w:sz="4"/>
+              <w:right w:val="single" w:color="999999" w:sz="4"/>
+            </w:tcBorders>
+            <w:tcMar>
+              <w:top w:type="dxa" w:w="80"/>
+              <w:left w:type="dxa" w:w="120"/>
+              <w:bottom w:type="dxa" w:w="80"/>
+              <w:right w:type="dxa" w:w="120"/>
+            </w:tcMar>
+          </w:tcPr>
+          <w:p>
+            <w:pPr>
+              <w:spacing w:after="0"/>
+            </w:pPr>
+            <w:r>
+              <w:rPr>
+                <w:rFonts w:ascii="Calibri" w:cs="Calibri" w:eastAsia="Calibri" w:hAnsi="Calibri"/>
+                <w:sz w:val="20"/>
+                <w:szCs w:val="20"/>
+              </w:rPr>
+              <w:t xml:space="preserve">−0.004</w:t>
+            </w:r>
+          </w:p>
+        </w:tc>
+        <w:tc>
+          <w:tcPr>
+            <w:tcW w:type="dxa" w:w="2800"/>
+            <w:tcBorders>
+              <w:top w:val="single" w:color="999999" w:sz="4"/>
+              <w:left w:val="single" w:color="999999" w:sz="4"/>
+              <w:bottom w:val="single" w:color="999999" w:sz="4"/>
+              <w:right w:val="single" w:color="999999" w:sz="4"/>
+            </w:tcBorders>
+            <w:tcMar>
+              <w:top w:type="dxa" w:w="80"/>
+              <w:left w:type="dxa" w:w="120"/>
+              <w:bottom w:type="dxa" w:w="80"/>
+              <w:right w:type="dxa" w:w="120"/>
+            </w:tcMar>
+          </w:tcPr>
+          <w:p>
+            <w:pPr>
+              <w:spacing w:after="0"/>
+            </w:pPr>
+            <w:r>
+              <w:rPr>
+                <w:rFonts w:ascii="Calibri" w:cs="Calibri" w:eastAsia="Calibri" w:hAnsi="Calibri"/>
+                <w:sz w:val="20"/>
+                <w:szCs w:val="20"/>
+              </w:rPr>
+              <w:t xml:space="preserve">−0.016 [−0.052, +0.024]; 0.541</w:t>
+            </w:r>
+          </w:p>
+        </w:tc>
+        <w:tc>
+          <w:tcPr>
+            <w:tcW w:type="dxa" w:w="2800"/>
+            <w:tcBorders>
+              <w:top w:val="single" w:color="999999" w:sz="4"/>
+              <w:left w:val="single" w:color="999999" w:sz="4"/>
+              <w:bottom w:val="single" w:color="999999" w:sz="4"/>
+              <w:right w:val="single" w:color="999999" w:sz="4"/>
+            </w:tcBorders>
+            <w:tcMar>
+              <w:top w:type="dxa" w:w="80"/>
+              <w:left w:type="dxa" w:w="120"/>
+              <w:bottom w:type="dxa" w:w="80"/>
+              <w:right w:type="dxa" w:w="120"/>
+            </w:tcMar>
+          </w:tcPr>
+          <w:p>
+            <w:pPr>
+              <w:spacing w:after="0"/>
+            </w:pPr>
+            <w:r>
+              <w:rPr>
+                <w:rFonts w:ascii="Calibri" w:cs="Calibri" w:eastAsia="Calibri" w:hAnsi="Calibri"/>
+                <w:sz w:val="20"/>
+                <w:szCs w:val="20"/>
+              </w:rPr>
+              <w:t xml:space="preserve">−0.020 [−0.060, +0.020]; 0.424</w:t>
+            </w:r>
+          </w:p>
+        </w:tc>
+      </w:tr>
+      <w:tr>
+        <w:tc>
+          <w:tcPr>
+            <w:tcW w:type="dxa" w:w="1500"/>
+            <w:tcBorders>
+              <w:top w:val="single" w:color="999999" w:sz="4"/>
+              <w:left w:val="single" w:color="999999" w:sz="4"/>
+              <w:bottom w:val="single" w:color="999999" w:sz="4"/>
+              <w:right w:val="single" w:color="999999" w:sz="4"/>
+            </w:tcBorders>
+            <w:tcMar>
+              <w:top w:type="dxa" w:w="80"/>
+              <w:left w:type="dxa" w:w="120"/>
+              <w:bottom w:type="dxa" w:w="80"/>
+              <w:right w:type="dxa" w:w="120"/>
+            </w:tcMar>
+          </w:tcPr>
+          <w:p>
+            <w:pPr>
+              <w:spacing w:after="0"/>
+            </w:pPr>
+            <w:r>
+              <w:rPr>
+                <w:rFonts w:ascii="Calibri" w:cs="Calibri" w:eastAsia="Calibri" w:hAnsi="Calibri"/>
+                <w:sz w:val="20"/>
+                <w:szCs w:val="20"/>
+              </w:rPr>
+              <w:t xml:space="preserve">llama_3_2_3b</w:t>
+            </w:r>
+          </w:p>
+        </w:tc>
+        <w:tc>
+          <w:tcPr>
+            <w:tcW w:type="dxa" w:w="1700"/>
+            <w:tcBorders>
+              <w:top w:val="single" w:color="999999" w:sz="4"/>
+              <w:left w:val="single" w:color="999999" w:sz="4"/>
+              <w:bottom w:val="single" w:color="999999" w:sz="4"/>
+              <w:right w:val="single" w:color="999999" w:sz="4"/>
+            </w:tcBorders>
+            <w:tcMar>
+              <w:top w:type="dxa" w:w="80"/>
+              <w:left w:type="dxa" w:w="120"/>
+              <w:bottom w:type="dxa" w:w="80"/>
+              <w:right w:type="dxa" w:w="120"/>
+            </w:tcMar>
+          </w:tcPr>
+          <w:p>
+            <w:pPr>
+              <w:spacing w:after="0"/>
+            </w:pPr>
+            <w:r>
+              <w:rPr>
+                <w:rFonts w:ascii="Calibri" w:cs="Calibri" w:eastAsia="Calibri" w:hAnsi="Calibri"/>
+                <w:sz w:val="20"/>
+                <w:szCs w:val="20"/>
+              </w:rPr>
+              <w:t xml:space="preserve">+0.016</w:t>
+            </w:r>
+          </w:p>
+        </w:tc>
+        <w:tc>
+          <w:tcPr>
+            <w:tcW w:type="dxa" w:w="2800"/>
+            <w:tcBorders>
+              <w:top w:val="single" w:color="999999" w:sz="4"/>
+              <w:left w:val="single" w:color="999999" w:sz="4"/>
+              <w:bottom w:val="single" w:color="999999" w:sz="4"/>
+              <w:right w:val="single" w:color="999999" w:sz="4"/>
+            </w:tcBorders>
+            <w:tcMar>
+              <w:top w:type="dxa" w:w="80"/>
+              <w:left w:type="dxa" w:w="120"/>
+              <w:bottom w:type="dxa" w:w="80"/>
+              <w:right w:type="dxa" w:w="120"/>
+            </w:tcMar>
+          </w:tcPr>
+          <w:p>
+            <w:pPr>
+              <w:spacing w:after="0"/>
+            </w:pPr>
+            <w:r>
+              <w:rPr>
+                <w:rFonts w:ascii="Calibri" w:cs="Calibri" w:eastAsia="Calibri" w:hAnsi="Calibri"/>
+                <w:sz w:val="20"/>
+                <w:szCs w:val="20"/>
+              </w:rPr>
+              <w:t xml:space="preserve">+0.004 [−0.028, +0.036]; 1.000</w:t>
+            </w:r>
+          </w:p>
+        </w:tc>
+        <w:tc>
+          <w:tcPr>
+            <w:tcW w:type="dxa" w:w="2800"/>
+            <w:tcBorders>
+              <w:top w:val="single" w:color="999999" w:sz="4"/>
+              <w:left w:val="single" w:color="999999" w:sz="4"/>
+              <w:bottom w:val="single" w:color="999999" w:sz="4"/>
+              <w:right w:val="single" w:color="999999" w:sz="4"/>
+            </w:tcBorders>
+            <w:tcMar>
+              <w:top w:type="dxa" w:w="80"/>
+              <w:left w:type="dxa" w:w="120"/>
+              <w:bottom w:type="dxa" w:w="80"/>
+              <w:right w:type="dxa" w:w="120"/>
+            </w:tcMar>
+          </w:tcPr>
+          <w:p>
+            <w:pPr>
+              <w:spacing w:after="0"/>
+            </w:pPr>
+            <w:r>
+              <w:rPr>
+                <w:rFonts w:ascii="Calibri" w:cs="Calibri" w:eastAsia="Calibri" w:hAnsi="Calibri"/>
+                <w:sz w:val="20"/>
+                <w:szCs w:val="20"/>
+              </w:rPr>
+              <w:t xml:space="preserve">0.000 [−0.032, +0.032]; 1.000</w:t>
+            </w:r>
+          </w:p>
+        </w:tc>
+      </w:tr>
+      <w:tr>
+        <w:tc>
+          <w:tcPr>
+            <w:tcW w:type="dxa" w:w="1500"/>
+            <w:tcBorders>
+              <w:top w:val="single" w:color="999999" w:sz="4"/>
+              <w:left w:val="single" w:color="999999" w:sz="4"/>
+              <w:bottom w:val="single" w:color="999999" w:sz="4"/>
+              <w:right w:val="single" w:color="999999" w:sz="4"/>
+            </w:tcBorders>
+            <w:tcMar>
+              <w:top w:type="dxa" w:w="80"/>
+              <w:left w:type="dxa" w:w="120"/>
+              <w:bottom w:type="dxa" w:w="80"/>
+              <w:right w:type="dxa" w:w="120"/>
+            </w:tcMar>
+          </w:tcPr>
+          <w:p>
+            <w:pPr>
+              <w:spacing w:after="0"/>
+            </w:pPr>
+            <w:r>
+              <w:rPr>
+                <w:rFonts w:ascii="Calibri" w:cs="Calibri" w:eastAsia="Calibri" w:hAnsi="Calibri"/>
+                <w:sz w:val="20"/>
+                <w:szCs w:val="20"/>
+              </w:rPr>
+              <w:t xml:space="preserve">mistral_7b</w:t>
+            </w:r>
+          </w:p>
+        </w:tc>
+        <w:tc>
+          <w:tcPr>
+            <w:tcW w:type="dxa" w:w="1700"/>
+            <w:tcBorders>
+              <w:top w:val="single" w:color="999999" w:sz="4"/>
+              <w:left w:val="single" w:color="999999" w:sz="4"/>
+              <w:bottom w:val="single" w:color="999999" w:sz="4"/>
+              <w:right w:val="single" w:color="999999" w:sz="4"/>
+            </w:tcBorders>
+            <w:tcMar>
+              <w:top w:type="dxa" w:w="80"/>
+              <w:left w:type="dxa" w:w="120"/>
+              <w:bottom w:type="dxa" w:w="80"/>
+              <w:right w:type="dxa" w:w="120"/>
+            </w:tcMar>
+          </w:tcPr>
+          <w:p>
+            <w:pPr>
+              <w:spacing w:after="0"/>
+            </w:pPr>
+            <w:r>
+              <w:rPr>
+                <w:rFonts w:ascii="Calibri" w:cs="Calibri" w:eastAsia="Calibri" w:hAnsi="Calibri"/>
+                <w:sz w:val="20"/>
+                <w:szCs w:val="20"/>
+              </w:rPr>
+              <w:t xml:space="preserve">0.000</w:t>
+            </w:r>
+          </w:p>
+        </w:tc>
+        <w:tc>
+          <w:tcPr>
+            <w:tcW w:type="dxa" w:w="2800"/>
+            <w:tcBorders>
+              <w:top w:val="single" w:color="999999" w:sz="4"/>
+              <w:left w:val="single" w:color="999999" w:sz="4"/>
+              <w:bottom w:val="single" w:color="999999" w:sz="4"/>
+              <w:right w:val="single" w:color="999999" w:sz="4"/>
+            </w:tcBorders>
+            <w:tcMar>
+              <w:top w:type="dxa" w:w="80"/>
+              <w:left w:type="dxa" w:w="120"/>
+              <w:bottom w:type="dxa" w:w="80"/>
+              <w:right w:type="dxa" w:w="120"/>
+            </w:tcMar>
+          </w:tcPr>
+          <w:p>
+            <w:pPr>
+              <w:spacing w:after="0"/>
+            </w:pPr>
+            <w:r>
+              <w:rPr>
+                <w:rFonts w:ascii="Calibri" w:cs="Calibri" w:eastAsia="Calibri" w:hAnsi="Calibri"/>
+                <w:sz w:val="20"/>
+                <w:szCs w:val="20"/>
+              </w:rPr>
+              <w:t xml:space="preserve">−0.004 [−0.036, +0.028]; 1.000</w:t>
+            </w:r>
+          </w:p>
+        </w:tc>
+        <w:tc>
+          <w:tcPr>
+            <w:tcW w:type="dxa" w:w="2800"/>
+            <w:tcBorders>
+              <w:top w:val="single" w:color="999999" w:sz="4"/>
+              <w:left w:val="single" w:color="999999" w:sz="4"/>
+              <w:bottom w:val="single" w:color="999999" w:sz="4"/>
+              <w:right w:val="single" w:color="999999" w:sz="4"/>
+            </w:tcBorders>
+            <w:tcMar>
+              <w:top w:type="dxa" w:w="80"/>
+              <w:left w:type="dxa" w:w="120"/>
+              <w:bottom w:type="dxa" w:w="80"/>
+              <w:right w:type="dxa" w:w="120"/>
+            </w:tcMar>
+          </w:tcPr>
+          <w:p>
+            <w:pPr>
+              <w:spacing w:after="0"/>
+            </w:pPr>
+            <w:r>
+              <w:rPr>
+                <w:rFonts w:ascii="Calibri" w:cs="Calibri" w:eastAsia="Calibri" w:hAnsi="Calibri"/>
+                <w:sz w:val="20"/>
+                <w:szCs w:val="20"/>
+              </w:rPr>
+              <w:t xml:space="preserve">−0.008 [−0.044, +0.024]; 0.815</w:t>
+            </w:r>
+          </w:p>
+        </w:tc>
+      </w:tr>
+      <w:tr>
+        <w:tc>
+          <w:tcPr>
+            <w:tcW w:type="dxa" w:w="1500"/>
+            <w:tcBorders>
+              <w:top w:val="single" w:color="999999" w:sz="4"/>
+              <w:left w:val="single" w:color="999999" w:sz="4"/>
+              <w:bottom w:val="single" w:color="999999" w:sz="4"/>
+              <w:right w:val="single" w:color="999999" w:sz="4"/>
+            </w:tcBorders>
+            <w:tcMar>
+              <w:top w:type="dxa" w:w="80"/>
+              <w:left w:type="dxa" w:w="120"/>
+              <w:bottom w:type="dxa" w:w="80"/>
+              <w:right w:type="dxa" w:w="120"/>
+            </w:tcMar>
+          </w:tcPr>
+          <w:p>
+            <w:pPr>
+              <w:spacing w:after="0"/>
+            </w:pPr>
+            <w:r>
+              <w:rPr>
+                <w:rFonts w:ascii="Calibri" w:cs="Calibri" w:eastAsia="Calibri" w:hAnsi="Calibri"/>
+                <w:sz w:val="20"/>
+                <w:szCs w:val="20"/>
+              </w:rPr>
+              <w:t xml:space="preserve">phi4_mini</w:t>
+            </w:r>
+          </w:p>
+        </w:tc>
+        <w:tc>
+          <w:tcPr>
+            <w:tcW w:type="dxa" w:w="1700"/>
+            <w:tcBorders>
+              <w:top w:val="single" w:color="999999" w:sz="4"/>
+              <w:left w:val="single" w:color="999999" w:sz="4"/>
+              <w:bottom w:val="single" w:color="999999" w:sz="4"/>
+              <w:right w:val="single" w:color="999999" w:sz="4"/>
+            </w:tcBorders>
+            <w:tcMar>
+              <w:top w:type="dxa" w:w="80"/>
+              <w:left w:type="dxa" w:w="120"/>
+              <w:bottom w:type="dxa" w:w="80"/>
+              <w:right w:type="dxa" w:w="120"/>
+            </w:tcMar>
+          </w:tcPr>
+          <w:p>
+            <w:pPr>
+              <w:spacing w:after="0"/>
+            </w:pPr>
+            <w:r>
+              <w:rPr>
+                <w:rFonts w:ascii="Calibri" w:cs="Calibri" w:eastAsia="Calibri" w:hAnsi="Calibri"/>
+                <w:sz w:val="20"/>
+                <w:szCs w:val="20"/>
+              </w:rPr>
+              <w:t xml:space="preserve">−0.048 ★</w:t>
+            </w:r>
+          </w:p>
+        </w:tc>
+        <w:tc>
+          <w:tcPr>
+            <w:tcW w:type="dxa" w:w="2800"/>
+            <w:tcBorders>
+              <w:top w:val="single" w:color="999999" w:sz="4"/>
+              <w:left w:val="single" w:color="999999" w:sz="4"/>
+              <w:bottom w:val="single" w:color="999999" w:sz="4"/>
+              <w:right w:val="single" w:color="999999" w:sz="4"/>
+            </w:tcBorders>
+            <w:tcMar>
+              <w:top w:type="dxa" w:w="80"/>
+              <w:left w:type="dxa" w:w="120"/>
+              <w:bottom w:type="dxa" w:w="80"/>
+              <w:right w:type="dxa" w:w="120"/>
+            </w:tcMar>
+          </w:tcPr>
+          <w:p>
+            <w:pPr>
+              <w:spacing w:after="0"/>
+            </w:pPr>
+            <w:r>
+              <w:rPr>
+                <w:rFonts w:ascii="Calibri" w:cs="Calibri" w:eastAsia="Calibri" w:hAnsi="Calibri"/>
+                <w:sz w:val="20"/>
+                <w:szCs w:val="20"/>
+              </w:rPr>
+              <w:t xml:space="preserve">+0.016 [−0.028, +0.060]; 0.597</w:t>
+            </w:r>
+          </w:p>
+        </w:tc>
+        <w:tc>
+          <w:tcPr>
+            <w:tcW w:type="dxa" w:w="2800"/>
+            <w:tcBorders>
+              <w:top w:val="single" w:color="999999" w:sz="4"/>
+              <w:left w:val="single" w:color="999999" w:sz="4"/>
+              <w:bottom w:val="single" w:color="999999" w:sz="4"/>
+              <w:right w:val="single" w:color="999999" w:sz="4"/>
+            </w:tcBorders>
+            <w:tcMar>
+              <w:top w:type="dxa" w:w="80"/>
+              <w:left w:type="dxa" w:w="120"/>
+              <w:bottom w:type="dxa" w:w="80"/>
+              <w:right w:type="dxa" w:w="120"/>
+            </w:tcMar>
+          </w:tcPr>
+          <w:p>
+            <w:pPr>
+              <w:spacing w:after="0"/>
+            </w:pPr>
+            <w:r>
+              <w:rPr>
+                <w:rFonts w:ascii="Calibri" w:cs="Calibri" w:eastAsia="Calibri" w:hAnsi="Calibri"/>
+                <w:sz w:val="20"/>
+                <w:szCs w:val="20"/>
+              </w:rPr>
+              <w:t xml:space="preserve">−0.004 [−0.048, +0.036]; 1.000</w:t>
+            </w:r>
+          </w:p>
+        </w:tc>
+      </w:tr>
+    </w:tbl>
+    <w:p>
+      <w:pPr>
+        <w:spacing w:after="120" w:line="300"/>
+      </w:pPr>
+      <w:r>
+        <w:rPr>
+          <w:rFonts w:ascii="Calibri" w:cs="Calibri" w:eastAsia="Calibri" w:hAnsi="Calibri"/>
+          <w:sz w:val="18"/>
+          <w:szCs w:val="18"/>
+        </w:rPr>
+        <w:t xml:space="preserve">Table 6.4  Exploratory per-pair XSTest over-refusal deltas (NF4 − fp16) under the independent three-class refusal judge, both mappings, with paired-bootstrap 95% CIs (10 000 resamples, seed 42) and exact McNemar p-values; the primary regex ΔOR is shown for comparison (★ = the one regex-significant, FDR-surviving contrast). Every pair is reported regardless of direction under the pre-registered presentation rule; no judge delta is significant and none enters the §6.5.1 multiplicity family. From results_512/analysis/xstest_judge_agreement.json.</w:t>
       </w:r>
     </w:p>
     <w:p>

</xml_diff>

<commit_message>
Backfill the humanized report's Appendix G with the 2026-07-12/14 revision rows
The humanized alternate's Document Revision History jumped from 07-11
straight to 07-19, omitting the T35 sensitivity-layer row (07-12) and the
submission-safety patch row (07-14) that the master carries. Both rows
added in the humanized register; log-only, no scientific content changed.
Gates: surfaces 264/264, verify-claims 85/85.

Co-Authored-By: Claude Fable 5 <noreply@anthropic.com>
</commit_message>
<xml_diff>
--- a/docs/FYP_Report_2026-07-01_humanized.docx
+++ b/docs/FYP_Report_2026-07-01_humanized.docx
@@ -28208,6 +28208,190 @@
                 <w:szCs w:val="20"/>
               </w:rPr>
               <w:t xml:space="preserve">T36 human refusal gold set folded in (pre-registered Outcome J) plus a validation-informed parallel multiplicity family (D51). §6.12 Result 6 extended with the completed 200-item blinded single-annotator audit: the three-class judge aligns substantially better with the annotator than the regex on benign over-refusal (strict κ 0.485 vs −0.006, broad 0.662 vs 0.054; regex recall 2/63 full refusals, judge 61/63 with over-flagging concentrated on the partial/full boundary), so the Phi-4-mini −0.048 over-refusal survivor is carried as most plausibly a regex measurement artifact. Disclosures added: a single-annotator reference set on a disagreement-enriched draw, not population ground truth; a shared benchmark taxonomy; and D45 timing that was judge-outcome-blind but regex-outcome-aware. §6.5.1 adds the composition-locked validation-informed parallel BH-FDR family (over-refusal scored judge-strict; docs/VALIDATION_INFORMED_FAMILY_NOTE.md): two survivors, both capability effects, purely deflationary; the registered regex family remains the family of record. RQ2 restated scorer-invariantly: no scorer finds a statistically significant over-refusal increase in any pair. New committed artifacts: xstest_human_validation.json, multiple_comparisons_judge_strict.json. No registered number changed. The same 2026-07-19 pass also folds in the T37/T39 evidence: the open-weight Llama-Guard-3-8B third judge (revision-pinned, all fifteen aliases re-scored with zero parse errors, κ 0.36–0.92 versus the classifier, every per-pair ΔASR non-significant, retiring the versioned-API-only reproducibility caveat, bounded by the construct-mismatch caveat that Llama-Guard answers a looser safety question; §6.12, judge_pairwise_agreement_llamaguard.{json,csv}) and the multi-seed arm extended from three to all five pairs (Mistral seed mean +0.012, Phi −0.012, both within noise; the greedy points for these two pairs sit just outside narrow zero-straddling seed ranges, disclosed in §6.6.1; sensitivity_multiseed.json).</w:t>
+            </w:r>
+          </w:p>
+        </w:tc>
+      </w:tr>
+      <w:tr>
+        <w:tc>
+          <w:tcPr>
+            <w:tcW w:type="dxa" w:w="2200"/>
+            <w:tcBorders>
+              <w:top w:val="single" w:color="999999" w:sz="4"/>
+              <w:left w:val="single" w:color="999999" w:sz="4"/>
+              <w:bottom w:val="single" w:color="999999" w:sz="4"/>
+              <w:right w:val="single" w:color="999999" w:sz="4"/>
+            </w:tcBorders>
+            <w:tcMar>
+              <w:top w:type="dxa" w:w="80"/>
+              <w:left w:type="dxa" w:w="120"/>
+              <w:bottom w:type="dxa" w:w="80"/>
+              <w:right w:type="dxa" w:w="120"/>
+            </w:tcMar>
+          </w:tcPr>
+          <w:p>
+            <w:pPr>
+              <w:spacing w:after="0"/>
+            </w:pPr>
+            <w:r>
+              <w:rPr>
+                <w:rFonts w:ascii="Calibri" w:cs="Calibri" w:eastAsia="Calibri" w:hAnsi="Calibri"/>
+                <w:sz w:val="20"/>
+                <w:szCs w:val="20"/>
+              </w:rPr>
+              <w:t xml:space="preserve">2026-07-14 12:00</w:t>
+            </w:r>
+          </w:p>
+        </w:tc>
+        <w:tc>
+          <w:tcPr>
+            <w:tcW w:type="dxa" w:w="3000"/>
+            <w:tcBorders>
+              <w:top w:val="single" w:color="999999" w:sz="4"/>
+              <w:left w:val="single" w:color="999999" w:sz="4"/>
+              <w:bottom w:val="single" w:color="999999" w:sz="4"/>
+              <w:right w:val="single" w:color="999999" w:sz="4"/>
+            </w:tcBorders>
+            <w:tcMar>
+              <w:top w:type="dxa" w:w="80"/>
+              <w:left w:type="dxa" w:w="120"/>
+              <w:bottom w:type="dxa" w:w="80"/>
+              <w:right w:type="dxa" w:w="120"/>
+            </w:tcMar>
+          </w:tcPr>
+          <w:p>
+            <w:pPr>
+              <w:spacing w:after="0"/>
+            </w:pPr>
+            <w:r>
+              <w:rPr>
+                <w:rFonts w:ascii="Calibri" w:cs="Calibri" w:eastAsia="Calibri" w:hAnsi="Calibri"/>
+                <w:sz w:val="20"/>
+                <w:szCs w:val="20"/>
+              </w:rPr>
+              <w:t xml:space="preserve">FYP_Report_2026-07-01_v5.docx (superseded by the 2026-07-19 pass)</w:t>
+            </w:r>
+          </w:p>
+        </w:tc>
+        <w:tc>
+          <w:tcPr>
+            <w:tcW w:type="dxa" w:w="4160"/>
+            <w:tcBorders>
+              <w:top w:val="single" w:color="999999" w:sz="4"/>
+              <w:left w:val="single" w:color="999999" w:sz="4"/>
+              <w:bottom w:val="single" w:color="999999" w:sz="4"/>
+              <w:right w:val="single" w:color="999999" w:sz="4"/>
+            </w:tcBorders>
+            <w:tcMar>
+              <w:top w:type="dxa" w:w="80"/>
+              <w:left w:type="dxa" w:w="120"/>
+              <w:bottom w:type="dxa" w:w="80"/>
+              <w:right w:type="dxa" w:w="120"/>
+            </w:tcMar>
+          </w:tcPr>
+          <w:p>
+            <w:pPr>
+              <w:spacing w:after="0"/>
+            </w:pPr>
+            <w:r>
+              <w:rPr>
+                <w:rFonts w:ascii="Calibri" w:cs="Calibri" w:eastAsia="Calibri" w:hAnsi="Calibri"/>
+                <w:sz w:val="20"/>
+                <w:szCs w:val="20"/>
+              </w:rPr>
+              <w:t xml:space="preserve">Submission-safety patch (verified external-audit remediation, pulled ahead of the deferred T36/T37/T39 evidence fold-in). Corrected a factual error: ARC-Challenge had been described as 'immune to / not subject to' the 4-bit answer-format asymmetry (§6.5, §6.4.1, §6.2, Ch8), but the committed strict-parser sensitivity (results_512/analysis/parser_strict_sensitivity.json) shows the smallest pair's 4-bit ARC answers fall to the lenient fallback even more than its MMLU (52.3% vs 48.7%; 2.5%/3.3% at fp16). ARC's near-zero primary delta (−0.009) is therefore the lenient parser salvaging format-broken answers, not immunity; under a strict parser ARC −0.343 and MMLU −0.293 fall comparably. Capability loss reframed as a lenient/strict bracket (direction parser-robust, magnitude parser-dependent), and answer-format parsing added as a third measurement-dependence axis alongside the harm and over-refusal scorers. The statistical and interpretation register was tightened per the audit: the κ human-validation is stated as conservative rather than a proven lower bound and as a disagreement-enriched, non-population estimate (§6.12); causal language is scoped to isolating quantization against model-provenance confounds; scale and novelty claims narrowed. T37 (LlamaGuard) and T39 (Mistral/Phi multi-seed) reworded from future work to executed with verification pending (no numbers folded in yet). Numeric fixes: Qwen3-1.7B XSTest has 10 discordant prompts, not 11 (b=2, c=8; p=0.109 unchanged); Llama baseline over-refusal 0.032 (the v2 scorer of record, not the retired 0.036); test inventory refreshed. No registered result number changed.</w:t>
+            </w:r>
+          </w:p>
+        </w:tc>
+      </w:tr>
+      <w:tr>
+        <w:tc>
+          <w:tcPr>
+            <w:tcW w:type="dxa" w:w="2200"/>
+            <w:tcBorders>
+              <w:top w:val="single" w:color="999999" w:sz="4"/>
+              <w:left w:val="single" w:color="999999" w:sz="4"/>
+              <w:bottom w:val="single" w:color="999999" w:sz="4"/>
+              <w:right w:val="single" w:color="999999" w:sz="4"/>
+            </w:tcBorders>
+            <w:tcMar>
+              <w:top w:type="dxa" w:w="80"/>
+              <w:left w:type="dxa" w:w="120"/>
+              <w:bottom w:type="dxa" w:w="80"/>
+              <w:right w:type="dxa" w:w="120"/>
+            </w:tcMar>
+          </w:tcPr>
+          <w:p>
+            <w:pPr>
+              <w:spacing w:after="0"/>
+            </w:pPr>
+            <w:r>
+              <w:rPr>
+                <w:rFonts w:ascii="Calibri" w:cs="Calibri" w:eastAsia="Calibri" w:hAnsi="Calibri"/>
+                <w:sz w:val="20"/>
+                <w:szCs w:val="20"/>
+              </w:rPr>
+              <w:t xml:space="preserve">2026-07-12 18:00</w:t>
+            </w:r>
+          </w:p>
+        </w:tc>
+        <w:tc>
+          <w:tcPr>
+            <w:tcW w:type="dxa" w:w="3000"/>
+            <w:tcBorders>
+              <w:top w:val="single" w:color="999999" w:sz="4"/>
+              <w:left w:val="single" w:color="999999" w:sz="4"/>
+              <w:bottom w:val="single" w:color="999999" w:sz="4"/>
+              <w:right w:val="single" w:color="999999" w:sz="4"/>
+            </w:tcBorders>
+            <w:tcMar>
+              <w:top w:type="dxa" w:w="80"/>
+              <w:left w:type="dxa" w:w="120"/>
+              <w:bottom w:type="dxa" w:w="80"/>
+              <w:right w:type="dxa" w:w="120"/>
+            </w:tcMar>
+          </w:tcPr>
+          <w:p>
+            <w:pPr>
+              <w:spacing w:after="0"/>
+            </w:pPr>
+            <w:r>
+              <w:rPr>
+                <w:rFonts w:ascii="Calibri" w:cs="Calibri" w:eastAsia="Calibri" w:hAnsi="Calibri"/>
+                <w:sz w:val="20"/>
+                <w:szCs w:val="20"/>
+              </w:rPr>
+              <w:t xml:space="preserve">FYP_Report_2026-07-01_v5.docx (superseded by the 2026-07-14 pass)</w:t>
+            </w:r>
+          </w:p>
+        </w:tc>
+        <w:tc>
+          <w:tcPr>
+            <w:tcW w:type="dxa" w:w="4160"/>
+            <w:tcBorders>
+              <w:top w:val="single" w:color="999999" w:sz="4"/>
+              <w:left w:val="single" w:color="999999" w:sz="4"/>
+              <w:bottom w:val="single" w:color="999999" w:sz="4"/>
+              <w:right w:val="single" w:color="999999" w:sz="4"/>
+            </w:tcBorders>
+            <w:tcMar>
+              <w:top w:type="dxa" w:w="80"/>
+              <w:left w:type="dxa" w:w="120"/>
+              <w:bottom w:type="dxa" w:w="80"/>
+              <w:right w:type="dxa" w:w="120"/>
+            </w:tcMar>
+          </w:tcPr>
+          <w:p>
+            <w:pPr>
+              <w:spacing w:after="0"/>
+            </w:pPr>
+            <w:r>
+              <w:rPr>
+                <w:rFonts w:ascii="Calibri" w:cs="Calibri" w:eastAsia="Calibri" w:hAnsi="Calibri"/>
+                <w:sz w:val="20"/>
+                <w:szCs w:val="20"/>
+              </w:rPr>
+              <w:t xml:space="preserve">T35 XSTest independent-refusal-judge sensitivity layer (decision D45). Added §6.12 Result 6 and Table 6.4: the 3,750 saved benign XSTest responses were re-scored by an independent three-class refusal judge (gpt-4o, pinned snapshot gpt-4o-2024-08-06, zero parse failures) using the XSTest paper's own taxonomy. Outcome C (does not replicate / scorer-dependent): the one FDR-surviving over-refusal contrast (Phi-4-mini −0.048, regex) is not reproduced by the judge (ΔOR +0.016 strict / −0.004 broad, both non-significant), and the two scorers agree only poorly-to-moderately on benign over-refusal (κ at or below 0.50). A scorer-dependence caveat was folded into §6.5, §6.5.1, and the Abstract's over-refusal-survivor mention. The deterministic regex remains the primary over-refusal scorer of record and the §6.5.1 BH-FDR family is unchanged; this is a sensitivity layer, mirroring the second HarmBench judge. No primary result number changed.</w:t>
             </w:r>
           </w:p>
         </w:tc>

</xml_diff>